<commit_message>
rozdzial 2 poprawka v2
</commit_message>
<xml_diff>
--- a/Praca Licencjacka/Praca Licencjacka.docx
+++ b/Praca Licencjacka/Praca Licencjacka.docx
@@ -4127,12 +4127,60 @@
         </w:rPr>
         <w:t xml:space="preserve"> Report</w:t>
       </w:r>
-      <w:r>
-        <w:rPr>
-          <w:rStyle w:val="FootnoteReference"/>
-        </w:rPr>
-        <w:footnoteReference w:id="1"/>
-      </w:r>
+      <w:sdt>
+        <w:sdtPr>
+          <w:rPr>
+            <w:i/>
+            <w:iCs/>
+          </w:rPr>
+          <w:id w:val="512876752"/>
+          <w:citation/>
+        </w:sdtPr>
+        <w:sdtContent>
+          <w:r>
+            <w:rPr>
+              <w:i/>
+              <w:iCs/>
+            </w:rPr>
+            <w:fldChar w:fldCharType="begin"/>
+          </w:r>
+          <w:r>
+            <w:rPr>
+              <w:i/>
+              <w:iCs/>
+            </w:rPr>
+            <w:instrText xml:space="preserve">CITATION www \l 2057 </w:instrText>
+          </w:r>
+          <w:r>
+            <w:rPr>
+              <w:i/>
+              <w:iCs/>
+            </w:rPr>
+            <w:fldChar w:fldCharType="separate"/>
+          </w:r>
+          <w:r>
+            <w:rPr>
+              <w:i/>
+              <w:iCs/>
+              <w:noProof/>
+            </w:rPr>
+            <w:t xml:space="preserve"> </w:t>
+          </w:r>
+          <w:r>
+            <w:rPr>
+              <w:noProof/>
+            </w:rPr>
+            <w:t>(www.videogameseurope.eu, 2023)</w:t>
+          </w:r>
+          <w:r>
+            <w:rPr>
+              <w:i/>
+              <w:iCs/>
+            </w:rPr>
+            <w:fldChar w:fldCharType="end"/>
+          </w:r>
+        </w:sdtContent>
+      </w:sdt>
       <w:r>
         <w:t>, szacuje się,</w:t>
       </w:r>
@@ -4161,21 +4209,73 @@
         <w:t>Steam</w:t>
       </w:r>
       <w:proofErr w:type="spellEnd"/>
-      <w:r>
-        <w:rPr>
-          <w:rStyle w:val="FootnoteReference"/>
-        </w:rPr>
-        <w:footnoteReference w:id="2"/>
-      </w:r>
+      <w:sdt>
+        <w:sdtPr>
+          <w:id w:val="-699864630"/>
+          <w:citation/>
+        </w:sdtPr>
+        <w:sdtContent>
+          <w:r>
+            <w:fldChar w:fldCharType="begin"/>
+          </w:r>
+          <w:r>
+            <w:instrText xml:space="preserve">CITATION www1 \l 2057 </w:instrText>
+          </w:r>
+          <w:r>
+            <w:fldChar w:fldCharType="separate"/>
+          </w:r>
+          <w:r>
+            <w:rPr>
+              <w:noProof/>
+            </w:rPr>
+            <w:t xml:space="preserve"> </w:t>
+          </w:r>
+          <w:r>
+            <w:rPr>
+              <w:noProof/>
+            </w:rPr>
+            <w:t>(www.ft.com, 2025)</w:t>
+          </w:r>
+          <w:r>
+            <w:fldChar w:fldCharType="end"/>
+          </w:r>
+        </w:sdtContent>
+      </w:sdt>
       <w:r>
         <w:t xml:space="preserve"> w 2025 roku wpłynęło 19 993 gier</w:t>
       </w:r>
-      <w:r>
-        <w:rPr>
-          <w:rStyle w:val="FootnoteReference"/>
-        </w:rPr>
-        <w:footnoteReference w:id="3"/>
-      </w:r>
+      <w:sdt>
+        <w:sdtPr>
+          <w:id w:val="218179020"/>
+          <w:citation/>
+        </w:sdtPr>
+        <w:sdtContent>
+          <w:r>
+            <w:fldChar w:fldCharType="begin"/>
+          </w:r>
+          <w:r>
+            <w:instrText xml:space="preserve">CITATION ste \l 2057 </w:instrText>
+          </w:r>
+          <w:r>
+            <w:fldChar w:fldCharType="separate"/>
+          </w:r>
+          <w:r>
+            <w:rPr>
+              <w:noProof/>
+            </w:rPr>
+            <w:t xml:space="preserve"> </w:t>
+          </w:r>
+          <w:r>
+            <w:rPr>
+              <w:noProof/>
+            </w:rPr>
+            <w:t>(steamdb.info, 2026)</w:t>
+          </w:r>
+          <w:r>
+            <w:fldChar w:fldCharType="end"/>
+          </w:r>
+        </w:sdtContent>
+      </w:sdt>
       <w:r>
         <w:t>.</w:t>
       </w:r>
@@ -4418,15 +4518,12 @@
     </w:p>
     <w:p>
       <w:r>
-        <w:t xml:space="preserve">Dość popularnym sposobem integracji wśród młodzieży i młodych dorosłych są spotkania w celu przeprowadzania rozgrywek RPG. Gracze wcielają się w role postaci w magicznym uniwersum (np. czarodzieje, elfy) i nieraz improwizują rozgrywkę podczas jej trwania. </w:t>
-      </w:r>
+        <w:t>Dość popularnym sposobem integracji wśród młodzieży i młodych dorosłych są spotkania w celu przeprowadzania rozgrywek RPG. Gracze wcielają się w role postaci w magicznym uniwersum (np. czarodzieje, elfy) i nieraz improwizują rozgrywkę podczas jej trwania. Niestety, trudno znaleźć ogólnodostępne rozwiązania oferujące przeniesienie tych światów w sferę cyfrową.</w:t>
+      </w:r>
+    </w:p>
+    <w:p>
       <w:r>
         <w:lastRenderedPageBreak/>
-        <w:t>Niestety, trudno znaleźć ogólnodostępne rozwiązania oferujące przeniesienie tych światów w sferę cyfrową.</w:t>
-      </w:r>
-    </w:p>
-    <w:p>
-      <w:r>
         <w:t xml:space="preserve">Popularne silniki, takie jak </w:t>
       </w:r>
       <w:r>
@@ -4529,14 +4626,60 @@
         </w:rPr>
         <w:t>ADRIFT</w:t>
       </w:r>
-      <w:r>
-        <w:rPr>
-          <w:rStyle w:val="FootnoteReference"/>
-          <w:i/>
-          <w:iCs/>
-        </w:rPr>
-        <w:footnoteReference w:id="4"/>
-      </w:r>
+      <w:sdt>
+        <w:sdtPr>
+          <w:rPr>
+            <w:i/>
+            <w:iCs/>
+          </w:rPr>
+          <w:id w:val="-244653836"/>
+          <w:citation/>
+        </w:sdtPr>
+        <w:sdtContent>
+          <w:r>
+            <w:rPr>
+              <w:i/>
+              <w:iCs/>
+            </w:rPr>
+            <w:fldChar w:fldCharType="begin"/>
+          </w:r>
+          <w:r>
+            <w:rPr>
+              <w:i/>
+              <w:iCs/>
+            </w:rPr>
+            <w:instrText xml:space="preserve">CITATION www2 \l 2057 </w:instrText>
+          </w:r>
+          <w:r>
+            <w:rPr>
+              <w:i/>
+              <w:iCs/>
+            </w:rPr>
+            <w:fldChar w:fldCharType="separate"/>
+          </w:r>
+          <w:r>
+            <w:rPr>
+              <w:i/>
+              <w:iCs/>
+              <w:noProof/>
+            </w:rPr>
+            <w:t xml:space="preserve"> </w:t>
+          </w:r>
+          <w:r>
+            <w:rPr>
+              <w:noProof/>
+            </w:rPr>
+            <w:t>(www.adrift.co, 2013)</w:t>
+          </w:r>
+          <w:r>
+            <w:rPr>
+              <w:i/>
+              <w:iCs/>
+            </w:rPr>
+            <w:fldChar w:fldCharType="end"/>
+          </w:r>
+        </w:sdtContent>
+      </w:sdt>
       <w:r>
         <w:t xml:space="preserve"> jest </w:t>
       </w:r>
@@ -4682,232 +4825,147 @@
       </w:pPr>
       <w:bookmarkStart w:id="3" w:name="_Toc225960472"/>
       <w:r>
+        <w:t xml:space="preserve">1.3. Charakterystyka gier typu </w:t>
+      </w:r>
+      <w:proofErr w:type="spellStart"/>
+      <w:r>
+        <w:t>text-based</w:t>
+      </w:r>
+      <w:proofErr w:type="spellEnd"/>
+      <w:r>
+        <w:t xml:space="preserve"> RPG</w:t>
+      </w:r>
+      <w:bookmarkEnd w:id="3"/>
+    </w:p>
+    <w:p>
+      <w:r>
+        <w:t xml:space="preserve">Gry typu </w:t>
+      </w:r>
+      <w:proofErr w:type="spellStart"/>
+      <w:r>
+        <w:t>text-based</w:t>
+      </w:r>
+      <w:proofErr w:type="spellEnd"/>
+      <w:r>
+        <w:t xml:space="preserve"> RPG (tekstowe gry fabularne) są specyficzną kategorią gier komputerowych, w których głównym środkiem przekazu informacji jest tekst. W </w:t>
+      </w:r>
+      <w:r>
         <w:lastRenderedPageBreak/>
-        <w:t xml:space="preserve">1.3. Charakterystyka gier typu </w:t>
+        <w:t>przeciwieństwie do gier opartych na grafice 2D lub 3D, interakcja z użytkownikiem odbywa się poprzez opisy słowne, komunikaty systemowe oraz decyzje podejmowane przez gracza.</w:t>
+      </w:r>
+    </w:p>
+    <w:p>
+      <w:r>
+        <w:t>Podstawowym elementem tego typu gier jest narracja, która opisuje świat gry, postacie oraz zdarzenia zachodzące w jego obrębie. Gracz wciela się w określoną rolę i podejmuje decyzje wpływające na dalszy przebieg rozgrywki. W zależności od przyjętej struktury, decyzje te mogą przyjmować formę wpisywanych komend tekstowych lub wyboru jednej z dostępnych opcji.</w:t>
+      </w:r>
+    </w:p>
+    <w:p>
+      <w:r>
+        <w:t xml:space="preserve">Wyróżnia się dwa główne podejścia do interakcji w grach tekstowych. Pierwszym z nich są systemy oparte na </w:t>
       </w:r>
       <w:proofErr w:type="spellStart"/>
       <w:r>
-        <w:t>text-based</w:t>
+        <w:t>parserze</w:t>
       </w:r>
       <w:proofErr w:type="spellEnd"/>
       <w:r>
-        <w:t xml:space="preserve"> RPG</w:t>
-      </w:r>
-      <w:bookmarkEnd w:id="3"/>
-    </w:p>
-    <w:p>
-      <w:r>
-        <w:t xml:space="preserve">Gry typu </w:t>
+        <w:t xml:space="preserve"> poleceń, w których użytkownik wprowadza komendy w języku naturalnym lub uproszczonej składni (np. „idź na północ”, „podnieś przedmiot”). Drugim podejściem są systemy wyboru (ang. choice-</w:t>
       </w:r>
       <w:proofErr w:type="spellStart"/>
       <w:r>
-        <w:t>text-based</w:t>
+        <w:t>based</w:t>
       </w:r>
       <w:proofErr w:type="spellEnd"/>
       <w:r>
-        <w:t xml:space="preserve"> RPG (tekstowe gry fabularne) są specyficzną kategorią gier komputerowych, w których głównym środkiem przekazu informacji jest tekst. W przeciwieństwie do gier opartych na grafice 2D lub 3D, interakcja z użytkownikiem odbywa się poprzez opisy słowne, komunikaty systemowe oraz decyzje podejmowane przez gracza.</w:t>
-      </w:r>
-    </w:p>
-    <w:p>
-      <w:r>
-        <w:t>Podstawowym elementem tego typu gier jest narracja, która opisuje świat gry, postacie oraz zdarzenia zachodzące w jego obrębie. Gracz wciela się w określoną rolę i podejmuje decyzje wpływające na dalszy przebieg rozgrywki. W zależności od przyjętej struktury, decyzje te mogą przyjmować formę wpisywanych komend tekstowych lub wyboru jednej z dostępnych opcji.</w:t>
-      </w:r>
-    </w:p>
-    <w:p>
-      <w:r>
-        <w:t xml:space="preserve">Wyróżnia się dwa główne podejścia do interakcji w grach tekstowych. Pierwszym z nich są systemy oparte na </w:t>
+        <w:t>), w których użytkownik podejmuje decyzje poprzez wybór jednej z predefiniowanych opcji przedstawionych przez system.</w:t>
+      </w:r>
+    </w:p>
+    <w:p>
+      <w:r>
+        <w:t>Ze względu na brak warstwy graficznej, gry tekstowe opierają się w dużym stopniu na wyobraźni użytkownika. Pozwala to na tworzenie złożonych światów i scenariuszy przy relatywnie niewielkich wymaganiach technicznych.</w:t>
+      </w:r>
+    </w:p>
+    <w:p>
+      <w:pPr>
+        <w:pStyle w:val="Heading2"/>
+      </w:pPr>
+      <w:bookmarkStart w:id="4" w:name="_Toc225960473"/>
+      <w:r>
+        <w:t>1.4. Struktura pracy</w:t>
+      </w:r>
+      <w:bookmarkEnd w:id="4"/>
+    </w:p>
+    <w:p>
+      <w:pPr>
+        <w:pStyle w:val="Heading1"/>
+      </w:pPr>
+      <w:bookmarkStart w:id="5" w:name="_Toc225960474"/>
+      <w:r>
+        <w:t>2. Analiza problemu i istniejących rozwiązań</w:t>
+      </w:r>
+      <w:bookmarkEnd w:id="5"/>
+    </w:p>
+    <w:p>
+      <w:pPr>
+        <w:pStyle w:val="Heading2"/>
+      </w:pPr>
+      <w:bookmarkStart w:id="6" w:name="_Toc225960475"/>
+      <w:r>
+        <w:t>2.1. Charakterystyka gier tekstowych RPG</w:t>
+      </w:r>
+      <w:bookmarkEnd w:id="6"/>
+    </w:p>
+    <w:p>
+      <w:r>
+        <w:t xml:space="preserve">Gry tekstowe RPG opierają się na relatywnie prostej warstwie prezentacji, jednak ich struktura wewnętrzna wymaga odpowiedniego zaprojektowania logiki systemu. W przeciwieństwie do gier graficznych, gdzie znaczną część złożoności stanowi </w:t>
       </w:r>
       <w:proofErr w:type="spellStart"/>
       <w:r>
-        <w:t>parserze</w:t>
+        <w:t>renderowanie</w:t>
       </w:r>
       <w:proofErr w:type="spellEnd"/>
       <w:r>
-        <w:t xml:space="preserve"> poleceń, w których użytkownik wprowadza komendy w języku naturalnym lub uproszczonej składni (np. „idź na północ”, „podnieś przedmiot”). Drugim podejściem są systemy wyboru (ang. choice-</w:t>
+        <w:t xml:space="preserve"> obrazu oraz fizyka, w grach tekstowych główny nacisk położony jest na przetwarzanie stanu gry oraz generowanie spójnej narracji.</w:t>
+      </w:r>
+    </w:p>
+    <w:p>
+      <w:r>
+        <w:t>Podstawowym elementem takiego systemu jest model świata gry, który przechowuje informacje o aktualnym stanie rozgrywki. Obejmuje on między innymi lokalizację gracza, dostępne obiekty, relacje między elementami świata oraz konsekwencje wcześniej podjętych decyzji. Każda akcja użytkownika powoduje zmianę tego stanu, co wpływa na dalszy przebieg gry.</w:t>
+      </w:r>
+    </w:p>
+    <w:p>
+      <w:r>
+        <w:t xml:space="preserve">Kolejnym istotnym komponentem jest mechanizm interpretacji działań gracza. W zależności od przyjętego podejścia może on przyjmować formę </w:t>
       </w:r>
       <w:proofErr w:type="spellStart"/>
       <w:r>
-        <w:t>based</w:t>
+        <w:t>parsera</w:t>
       </w:r>
       <w:proofErr w:type="spellEnd"/>
       <w:r>
-        <w:t>), w których użytkownik podejmuje decyzje poprzez wybór jednej z predefiniowanych opcji przedstawionych przez system.</w:t>
-      </w:r>
-    </w:p>
-    <w:p>
-      <w:r>
-        <w:t>Ze względu na brak warstwy graficznej, gry tekstowe opierają się w dużym stopniu na wyobraźni użytkownika. Pozwala to na tworzenie złożonych światów i scenariuszy przy relatywnie niewielkich wymaganiach technicznych.</w:t>
+        <w:t xml:space="preserve"> poleceń lub systemu wyboru. </w:t>
+      </w:r>
+      <w:proofErr w:type="spellStart"/>
+      <w:r>
+        <w:t>Parser</w:t>
+      </w:r>
+      <w:proofErr w:type="spellEnd"/>
+      <w:r>
+        <w:t xml:space="preserve"> poleceń wymaga przetwarzania wprowadzonych przez użytkownika komend i ich mapowania na operacje systemowe, co wiąże się z koniecznością obsługi różnych wariantów składni. System wyboru upraszcza ten proces poprzez ograniczenie możliwych działań do zestawu zdefiniowanych opcji.</w:t>
+      </w:r>
+    </w:p>
+    <w:p>
+      <w:r>
+        <w:t>Z punktu widzenia implementacyjnego, gry tekstowe RPG wymagają także systemu zapisu i odczytu stanu gry. Umożliwia to kontynuowanie rozgrywki w późniejszym czasie oraz stanowi istotny element doświadczenia użytkownika. Mechanizm ten musi uwzględniać wszystkie zmienne wpływające na przebieg gry.</w:t>
       </w:r>
     </w:p>
     <w:p>
       <w:pPr>
         <w:pStyle w:val="Heading2"/>
       </w:pPr>
-      <w:bookmarkStart w:id="4" w:name="_Toc225960473"/>
-      <w:r>
-        <w:t>1.4. Struktura pracy</w:t>
-      </w:r>
-      <w:bookmarkEnd w:id="4"/>
-    </w:p>
-    <w:p>
-      <w:r>
-        <w:t>Praca została podzielona na siedem rozdziałów, obejmujących kolejne etapy analizy, projektowania, implementacji oraz oceny opracowanego systemu.</w:t>
-      </w:r>
-    </w:p>
-    <w:p>
-      <w:r>
-        <w:t xml:space="preserve">W rozdziale pierwszym przedstawiono wprowadzenie do tematu pracy, określono jej cel i zakres, a także omówiono motywację powstania systemu oraz podstawowe cechy gier typu </w:t>
-      </w:r>
-      <w:proofErr w:type="spellStart"/>
-      <w:r>
-        <w:t>text-based</w:t>
-      </w:r>
-      <w:proofErr w:type="spellEnd"/>
-      <w:r>
-        <w:t xml:space="preserve"> RPG.</w:t>
-      </w:r>
-    </w:p>
-    <w:p>
-      <w:r>
-        <w:t>Rozdział drugi zawiera analizę problemu oraz przegląd istniejących rozwiązań. Przedstawiono w nim charakterystykę gier tekstowych RPG, omówiono dostępne narzędzia do ich tworzenia oraz platformy umożliwiające dystrybucję gier tworzonych przez użytkowników. Na podstawie przeprowadzonej analizy sformułowano wnioski oraz założenia projektowe systemu.</w:t>
-      </w:r>
-    </w:p>
-    <w:p>
-      <w:r>
-        <w:t>W rozdziale trzecim zaprezentowano analizę systemu. Określono wymagania funkcjonalne i niefunkcjonalne, zidentyfikowano aktorów systemu oraz przedstawiono diagram przypadków użycia wraz z opisem scenariuszy. Uzupełnieniem tej części są diagramy sekwencji oraz model danych systemu.</w:t>
-      </w:r>
-    </w:p>
-    <w:p>
-      <w:r>
-        <w:t xml:space="preserve">Rozdział czwarty poświęcony jest projektowi systemu. Opisano architekturę rozwiązania, projekt bazy danych oraz interfejs użytkownika. Przedstawiono również strukturę modułów systemu, w tym moduł użytkowników, </w:t>
-      </w:r>
-      <w:proofErr w:type="spellStart"/>
-      <w:r>
-        <w:t>marketplace</w:t>
-      </w:r>
-      <w:proofErr w:type="spellEnd"/>
-      <w:r>
-        <w:t xml:space="preserve"> gier, edytor gier oraz silnik rozgrywki, a także projekt API.</w:t>
-      </w:r>
-    </w:p>
-    <w:p>
-      <w:r>
-        <w:t xml:space="preserve">W rozdziale piątym opisano proces implementacji systemu. Przedstawiono wykorzystane technologie, a następnie omówiono implementację poszczególnych elementów systemu, </w:t>
-      </w:r>
+      <w:bookmarkStart w:id="7" w:name="_Toc225960476"/>
       <w:r>
         <w:lastRenderedPageBreak/>
-        <w:t xml:space="preserve">takich jak interfejs użytkownika, edytor gier, silnik rozgrywki, </w:t>
-      </w:r>
-      <w:proofErr w:type="spellStart"/>
-      <w:r>
-        <w:t>marketplace</w:t>
-      </w:r>
-      <w:proofErr w:type="spellEnd"/>
-      <w:r>
-        <w:t xml:space="preserve"> oraz system użytkowników.</w:t>
-      </w:r>
-    </w:p>
-    <w:p>
-      <w:r>
-        <w:t xml:space="preserve">Rozdział szósty dotyczy testowania systemu. Opisano strategię testowania, przeprowadzone testy </w:t>
-      </w:r>
-      <w:proofErr w:type="spellStart"/>
-      <w:r>
-        <w:t>frontendowe</w:t>
-      </w:r>
-      <w:proofErr w:type="spellEnd"/>
-      <w:r>
-        <w:t xml:space="preserve"> i </w:t>
-      </w:r>
-      <w:proofErr w:type="spellStart"/>
-      <w:r>
-        <w:t>backendowe</w:t>
-      </w:r>
-      <w:proofErr w:type="spellEnd"/>
-      <w:r>
-        <w:t>, testy funkcjonalne oraz przedstawiono ich wyniki.</w:t>
-      </w:r>
-    </w:p>
-    <w:p>
-      <w:r>
-        <w:t>W rozdziale siódmym zawarto podsumowanie pracy oraz ocenę stopnia realizacji założeń projektowych. Przedstawiono również ograniczenia systemu oraz możliwe kierunki jego dalszego rozwoju.</w:t>
-      </w:r>
-    </w:p>
-    <w:p>
-      <w:r>
-        <w:t>Ostatnim elementem pracy jest bibliografia, zawierająca wykorzystane źródła.</w:t>
-      </w:r>
-    </w:p>
-    <w:p>
-      <w:pPr>
-        <w:pStyle w:val="Heading1"/>
-      </w:pPr>
-      <w:bookmarkStart w:id="5" w:name="_Toc225960474"/>
-      <w:r>
-        <w:t>2. Analiza problemu i istniejących rozwiązań</w:t>
-      </w:r>
-      <w:bookmarkEnd w:id="5"/>
-    </w:p>
-    <w:p>
-      <w:pPr>
-        <w:pStyle w:val="Heading2"/>
-      </w:pPr>
-      <w:bookmarkStart w:id="6" w:name="_Toc225960475"/>
-      <w:r>
-        <w:t>2.1. Charakterystyka gier tekstowych RPG</w:t>
-      </w:r>
-      <w:bookmarkEnd w:id="6"/>
-    </w:p>
-    <w:p>
-      <w:r>
-        <w:t xml:space="preserve">Gry tekstowe RPG opierają się na relatywnie prostej warstwie prezentacji, jednak ich struktura wewnętrzna wymaga odpowiedniego zaprojektowania logiki systemu. W przeciwieństwie do gier graficznych, gdzie znaczną część złożoności stanowi </w:t>
-      </w:r>
-      <w:proofErr w:type="spellStart"/>
-      <w:r>
-        <w:t>renderowanie</w:t>
-      </w:r>
-      <w:proofErr w:type="spellEnd"/>
-      <w:r>
-        <w:t xml:space="preserve"> obrazu oraz fizyka, w grach tekstowych główny nacisk położony jest na przetwarzanie stanu gry oraz generowanie spójnej narracji.</w:t>
-      </w:r>
-    </w:p>
-    <w:p>
-      <w:r>
-        <w:t>Podstawowym elementem takiego systemu jest model świata gry, który przechowuje informacje o aktualnym stanie rozgrywki. Obejmuje on między innymi lokalizację gracza, dostępne obiekty, relacje między elementami świata oraz konsekwencje wcześniej podjętych decyzji. Każda akcja użytkownika powoduje zmianę tego stanu, co wpływa na dalszy przebieg gry.</w:t>
-      </w:r>
-    </w:p>
-    <w:p>
-      <w:r>
-        <w:t xml:space="preserve">Kolejnym istotnym komponentem jest mechanizm interpretacji działań gracza. W zależności od przyjętego podejścia może on przyjmować formę </w:t>
-      </w:r>
-      <w:proofErr w:type="spellStart"/>
-      <w:r>
-        <w:t>parsera</w:t>
-      </w:r>
-      <w:proofErr w:type="spellEnd"/>
-      <w:r>
-        <w:t xml:space="preserve"> poleceń lub systemu wyboru. </w:t>
-      </w:r>
-      <w:proofErr w:type="spellStart"/>
-      <w:r>
-        <w:t>Parser</w:t>
-      </w:r>
-      <w:proofErr w:type="spellEnd"/>
-      <w:r>
-        <w:t xml:space="preserve"> poleceń wymaga przetwarzania wprowadzonych przez użytkownika komend i ich mapowania na operacje systemowe, co wiąże się z koniecznością obsługi różnych wariantów składni. System wyboru upraszcza ten proces poprzez ograniczenie możliwych działań do zestawu zdefiniowanych opcji.</w:t>
-      </w:r>
-    </w:p>
-    <w:p>
-      <w:r>
-        <w:t>Z punktu widzenia implementacyjnego, gry tekstowe RPG wymagają także systemu zapisu i odczytu stanu gry. Umożliwia to kontynuowanie rozgrywki w późniejszym czasie oraz stanowi istotny element doświadczenia użytkownika. Mechanizm ten musi uwzględniać wszystkie zmienne wpływające na przebieg gry.</w:t>
-      </w:r>
-    </w:p>
-    <w:p>
-      <w:pPr>
-        <w:pStyle w:val="Heading2"/>
-      </w:pPr>
-      <w:bookmarkStart w:id="7" w:name="_Toc225960476"/>
-      <w:r>
         <w:t>2.2. Narzędzia do tworzenia gier RPG</w:t>
       </w:r>
       <w:bookmarkEnd w:id="7"/>
@@ -4982,11 +5040,7 @@
         <w:t>szeroki zakres funkcjonalności</w:t>
       </w:r>
       <w:r>
-        <w:t xml:space="preserve">, w tym biblioteki do symulacji </w:t>
-      </w:r>
-      <w:r>
-        <w:lastRenderedPageBreak/>
-        <w:t xml:space="preserve">fizyki w przestrzeni 3D, czy systemy oświetlenia z technologią </w:t>
+        <w:t xml:space="preserve">, w tym biblioteki do symulacji fizyki w przestrzeni 3D, czy systemy oświetlenia z technologią </w:t>
       </w:r>
       <w:proofErr w:type="spellStart"/>
       <w:r>
@@ -5056,12 +5110,38 @@
       <w:r>
         <w:t>dziesiątki gigabajtów (w zależności od komponentów)</w:t>
       </w:r>
-      <w:r>
-        <w:rPr>
-          <w:rStyle w:val="FootnoteReference"/>
-        </w:rPr>
-        <w:footnoteReference w:id="5"/>
-      </w:r>
+      <w:sdt>
+        <w:sdtPr>
+          <w:id w:val="-1897504102"/>
+          <w:citation/>
+        </w:sdtPr>
+        <w:sdtContent>
+          <w:r>
+            <w:fldChar w:fldCharType="begin"/>
+          </w:r>
+          <w:r>
+            <w:instrText xml:space="preserve">CITATION for \l 2057 </w:instrText>
+          </w:r>
+          <w:r>
+            <w:fldChar w:fldCharType="separate"/>
+          </w:r>
+          <w:r>
+            <w:rPr>
+              <w:noProof/>
+            </w:rPr>
+            <w:t xml:space="preserve"> </w:t>
+          </w:r>
+          <w:r>
+            <w:rPr>
+              <w:noProof/>
+            </w:rPr>
+            <w:t>(forums.unrealengine.com, 2022)</w:t>
+          </w:r>
+          <w:r>
+            <w:fldChar w:fldCharType="end"/>
+          </w:r>
+        </w:sdtContent>
+      </w:sdt>
       <w:r>
         <w:t>. Gry wytworzone w nich bardzo szybko osiągają setki megabajtów, rosnąc przy dodaniu każdej nowej paczki zasobów. Przy wytwarzaniu tekstowych gier RPG, takie rozmiary plików znacząco przekraczają minimum wymagane do dostarczenia w pełni funkcjonalnej gry.</w:t>
       </w:r>
@@ -5344,18 +5424,45 @@
       <w:r>
         <w:t xml:space="preserve"> od CD Projekt Red</w:t>
       </w:r>
-      <w:r>
-        <w:rPr>
-          <w:rStyle w:val="FootnoteReference"/>
-        </w:rPr>
-        <w:footnoteReference w:id="6"/>
-      </w:r>
+      <w:sdt>
+        <w:sdtPr>
+          <w:id w:val="641934227"/>
+          <w:citation/>
+        </w:sdtPr>
+        <w:sdtContent>
+          <w:r>
+            <w:fldChar w:fldCharType="begin"/>
+          </w:r>
+          <w:r>
+            <w:instrText xml:space="preserve">CITATION sto \l 2057 </w:instrText>
+          </w:r>
+          <w:r>
+            <w:fldChar w:fldCharType="separate"/>
+          </w:r>
+          <w:r>
+            <w:rPr>
+              <w:noProof/>
+            </w:rPr>
+            <w:t xml:space="preserve"> </w:t>
+          </w:r>
+          <w:r>
+            <w:rPr>
+              <w:noProof/>
+            </w:rPr>
+            <w:t>(store.steampowered.com, 2020)</w:t>
+          </w:r>
+          <w:r>
+            <w:fldChar w:fldCharType="end"/>
+          </w:r>
+        </w:sdtContent>
+      </w:sdt>
       <w:r>
         <w:t>) oraz małe, darmowe gry hobbistów.</w:t>
       </w:r>
     </w:p>
     <w:p>
       <w:r>
+        <w:lastRenderedPageBreak/>
         <w:t>Innym popularnym rozwiązaniem</w:t>
       </w:r>
       <w:r>
@@ -5401,7 +5508,6 @@
           <w:i/>
           <w:iCs/>
         </w:rPr>
-        <w:lastRenderedPageBreak/>
         <w:t>itch.io</w:t>
       </w:r>
       <w:r>
@@ -5459,12 +5565,38 @@
       <w:r>
         <w:t xml:space="preserve"> pobiera nawet 30% zarobków</w:t>
       </w:r>
-      <w:r>
-        <w:rPr>
-          <w:rStyle w:val="FootnoteReference"/>
-        </w:rPr>
-        <w:footnoteReference w:id="7"/>
-      </w:r>
+      <w:sdt>
+        <w:sdtPr>
+          <w:id w:val="-395508901"/>
+          <w:citation/>
+        </w:sdtPr>
+        <w:sdtContent>
+          <w:r>
+            <w:fldChar w:fldCharType="begin"/>
+          </w:r>
+          <w:r>
+            <w:instrText xml:space="preserve">CITATION ste1 \l 2057 </w:instrText>
+          </w:r>
+          <w:r>
+            <w:fldChar w:fldCharType="separate"/>
+          </w:r>
+          <w:r>
+            <w:rPr>
+              <w:noProof/>
+            </w:rPr>
+            <w:t xml:space="preserve"> </w:t>
+          </w:r>
+          <w:r>
+            <w:rPr>
+              <w:noProof/>
+            </w:rPr>
+            <w:t>(steamcommunity.com, 2018)</w:t>
+          </w:r>
+          <w:r>
+            <w:fldChar w:fldCharType="end"/>
+          </w:r>
+        </w:sdtContent>
+      </w:sdt>
       <w:r>
         <w:t>.</w:t>
       </w:r>
@@ -5530,6 +5662,7 @@
     </w:p>
     <w:p>
       <w:r>
+        <w:lastRenderedPageBreak/>
         <w:t>Na podstawie powyższych obserwacji można wskazać kluczowe problemy, takie jak wysoki próg wejścia, brak narzędzi typu no-</w:t>
       </w:r>
       <w:proofErr w:type="spellStart"/>
@@ -5547,262 +5680,255 @@
       </w:pPr>
       <w:bookmarkStart w:id="10" w:name="_Toc225960479"/>
       <w:r>
+        <w:t>2.5. Założenia projektowe systemu</w:t>
+      </w:r>
+      <w:bookmarkEnd w:id="10"/>
+    </w:p>
+    <w:p>
+      <w:r>
+        <w:t>Na podstawie zidentyfikowanych problemów sformułowano założenia projektowe opracowanego systemu.</w:t>
+      </w:r>
+    </w:p>
+    <w:p>
+      <w:r>
+        <w:t>W celu obniżenia progu wejścia przyjęto założenie, że system nie wymaga znajomości języków programowania i umożliwia tworzenie gier w modelu no-</w:t>
+      </w:r>
+      <w:proofErr w:type="spellStart"/>
+      <w:r>
+        <w:t>code</w:t>
+      </w:r>
+      <w:proofErr w:type="spellEnd"/>
+      <w:r>
+        <w:t>.</w:t>
+      </w:r>
+    </w:p>
+    <w:p>
+      <w:r>
+        <w:t>W odpowiedzi na brak integracji pomiędzy tworzeniem a dystrybucją, zaprojektowano rozwiązanie łączące edytor gier z platformą ich publikacji i udostępniania.</w:t>
+      </w:r>
+    </w:p>
+    <w:p>
+      <w:r>
+        <w:t>Ze względu na ograniczenia istniejących narzędzi desktopowych przyjęto, że system będzie dostępny w pełni przez przeglądarkę internetową, bez konieczności instalacji dodatkowego oprogramowania.</w:t>
+      </w:r>
+    </w:p>
+    <w:p>
+      <w:r>
+        <w:t>W celu zachowania charakteru gier tekstowych założono brak wsparcia dla elementów graficznych, takich jak obrazy, dźwięki czy wideo, koncentrując się na narracji tekstowej i interakcji użytkownika.</w:t>
+      </w:r>
+    </w:p>
+    <w:p>
+      <w:r>
+        <w:t>Dodatkowo przyjęto założenie implementacji mechanizmu zapisu i odczytu stanu gry, umożliwiającego kontynuowanie rozgrywki.</w:t>
+      </w:r>
+    </w:p>
+    <w:p>
+      <w:pPr>
+        <w:pStyle w:val="Heading1"/>
+      </w:pPr>
+      <w:bookmarkStart w:id="11" w:name="_Toc225960480"/>
+      <w:r>
         <w:lastRenderedPageBreak/>
-        <w:t>2.5. Założenia projektowe systemu</w:t>
-      </w:r>
-      <w:bookmarkEnd w:id="10"/>
-    </w:p>
-    <w:p>
-      <w:r>
-        <w:t>Na podstawie zidentyfikowanych problemów sformułowano założenia projektowe opracowanego systemu.</w:t>
-      </w:r>
-    </w:p>
-    <w:p>
-      <w:r>
-        <w:t>W celu obniżenia progu wejścia przyjęto założenie, że system nie wymaga znajomości języków programowania i umożliwia tworzenie gier w modelu no-</w:t>
+        <w:t>3. Analiza systemu</w:t>
+      </w:r>
+      <w:bookmarkEnd w:id="11"/>
+    </w:p>
+    <w:p>
+      <w:pPr>
+        <w:pStyle w:val="Heading2"/>
+      </w:pPr>
+      <w:bookmarkStart w:id="12" w:name="_Toc225960481"/>
+      <w:r>
+        <w:t>3.1. Wymagania funkcjonalne</w:t>
+      </w:r>
+      <w:bookmarkEnd w:id="12"/>
+    </w:p>
+    <w:p>
+      <w:pPr>
+        <w:pStyle w:val="Heading2"/>
+      </w:pPr>
+      <w:bookmarkStart w:id="13" w:name="_Toc225960482"/>
+      <w:r>
+        <w:t>3.2. Wymagania niefunkcjonalne</w:t>
+      </w:r>
+      <w:bookmarkEnd w:id="13"/>
+    </w:p>
+    <w:p>
+      <w:pPr>
+        <w:pStyle w:val="Heading2"/>
+      </w:pPr>
+      <w:bookmarkStart w:id="14" w:name="_Toc225960483"/>
+      <w:r>
+        <w:t>3.3. Aktorzy systemu</w:t>
+      </w:r>
+      <w:bookmarkEnd w:id="14"/>
+    </w:p>
+    <w:p>
+      <w:pPr>
+        <w:pStyle w:val="Heading2"/>
+      </w:pPr>
+      <w:bookmarkStart w:id="15" w:name="_Toc225960484"/>
+      <w:r>
+        <w:t>3.4. Diagram przypadków użycia</w:t>
+      </w:r>
+      <w:bookmarkEnd w:id="15"/>
+    </w:p>
+    <w:p>
+      <w:pPr>
+        <w:pStyle w:val="Heading2"/>
+      </w:pPr>
+      <w:bookmarkStart w:id="16" w:name="_Toc225960485"/>
+      <w:r>
+        <w:t>3.5. Opis scenariuszy przypadków użycia</w:t>
+      </w:r>
+      <w:bookmarkEnd w:id="16"/>
+    </w:p>
+    <w:p>
+      <w:pPr>
+        <w:pStyle w:val="Heading2"/>
+      </w:pPr>
+      <w:bookmarkStart w:id="17" w:name="_Toc225960486"/>
+      <w:r>
+        <w:t>3.6. Diagramy sekwencji</w:t>
+      </w:r>
+      <w:bookmarkEnd w:id="17"/>
+    </w:p>
+    <w:p>
+      <w:pPr>
+        <w:pStyle w:val="Heading2"/>
+      </w:pPr>
+      <w:bookmarkStart w:id="18" w:name="_Toc225960487"/>
+      <w:r>
+        <w:t>3.7. Model danych systemu</w:t>
+      </w:r>
+      <w:bookmarkEnd w:id="18"/>
+    </w:p>
+    <w:p>
+      <w:pPr>
+        <w:pStyle w:val="Heading1"/>
+      </w:pPr>
+      <w:bookmarkStart w:id="19" w:name="_Toc225960488"/>
+      <w:r>
+        <w:t>4. Projekt systemu</w:t>
+      </w:r>
+      <w:bookmarkEnd w:id="19"/>
+    </w:p>
+    <w:p>
+      <w:r>
+        <w:rPr>
+          <w:highlight w:val="yellow"/>
+        </w:rPr>
+        <w:t xml:space="preserve">Do stworzenia serwisu wykorzystano </w:t>
       </w:r>
       <w:proofErr w:type="spellStart"/>
       <w:r>
-        <w:t>code</w:t>
+        <w:rPr>
+          <w:highlight w:val="yellow"/>
+        </w:rPr>
+        <w:t>framework</w:t>
       </w:r>
       <w:proofErr w:type="spellEnd"/>
       <w:r>
-        <w:t>.</w:t>
-      </w:r>
-    </w:p>
-    <w:p>
-      <w:r>
-        <w:t>W odpowiedzi na brak integracji pomiędzy tworzeniem a dystrybucją, zaprojektowano rozwiązanie łączące edytor gier z platformą ich publikacji i udostępniania.</w:t>
-      </w:r>
-    </w:p>
-    <w:p>
-      <w:r>
-        <w:t>Ze względu na ograniczenia istniejących narzędzi desktopowych przyjęto, że system będzie dostępny w pełni przez przeglądarkę internetową, bez konieczności instalacji dodatkowego oprogramowania.</w:t>
-      </w:r>
-    </w:p>
-    <w:p>
-      <w:r>
-        <w:t>W celu zachowania charakteru gier tekstowych założono brak wsparcia dla elementów graficznych, takich jak obrazy, dźwięki czy wideo, koncentrując się na narracji tekstowej i interakcji użytkownika.</w:t>
-      </w:r>
-    </w:p>
-    <w:p>
-      <w:r>
-        <w:t>Dodatkowo przyjęto założenie implementacji mechanizmu zapisu i odczytu stanu gry, umożliwiającego kontynuowanie rozgrywki.</w:t>
-      </w:r>
-    </w:p>
-    <w:p>
-      <w:pPr>
-        <w:pStyle w:val="Heading1"/>
-      </w:pPr>
-      <w:bookmarkStart w:id="11" w:name="_Toc225960480"/>
-      <w:r>
-        <w:t>3. Analiza systemu</w:t>
-      </w:r>
-      <w:bookmarkEnd w:id="11"/>
-    </w:p>
-    <w:p>
-      <w:pPr>
-        <w:pStyle w:val="Heading2"/>
-      </w:pPr>
-      <w:bookmarkStart w:id="12" w:name="_Toc225960481"/>
-      <w:r>
-        <w:t>3.1. Wymagania funkcjonalne</w:t>
-      </w:r>
-      <w:bookmarkEnd w:id="12"/>
-    </w:p>
-    <w:p>
-      <w:pPr>
-        <w:pStyle w:val="Heading2"/>
-      </w:pPr>
-      <w:bookmarkStart w:id="13" w:name="_Toc225960482"/>
-      <w:r>
-        <w:t>3.2. Wymagania niefunkcjonalne</w:t>
-      </w:r>
-      <w:bookmarkEnd w:id="13"/>
-    </w:p>
-    <w:p>
-      <w:pPr>
-        <w:pStyle w:val="Heading2"/>
-      </w:pPr>
-      <w:bookmarkStart w:id="14" w:name="_Toc225960483"/>
-      <w:r>
-        <w:t>3.3. Aktorzy systemu</w:t>
-      </w:r>
-      <w:bookmarkEnd w:id="14"/>
-    </w:p>
-    <w:p>
-      <w:pPr>
-        <w:pStyle w:val="Heading2"/>
-      </w:pPr>
-      <w:bookmarkStart w:id="15" w:name="_Toc225960484"/>
-      <w:r>
-        <w:t>3.4. Diagram przypadków użycia</w:t>
-      </w:r>
-      <w:bookmarkEnd w:id="15"/>
-    </w:p>
-    <w:p>
-      <w:pPr>
-        <w:pStyle w:val="Heading2"/>
-      </w:pPr>
-      <w:bookmarkStart w:id="16" w:name="_Toc225960485"/>
-      <w:r>
-        <w:t>3.5. Opis scenariuszy przypadków użycia</w:t>
-      </w:r>
-      <w:bookmarkEnd w:id="16"/>
-    </w:p>
-    <w:p>
-      <w:pPr>
-        <w:pStyle w:val="Heading2"/>
-      </w:pPr>
-      <w:bookmarkStart w:id="17" w:name="_Toc225960486"/>
-      <w:r>
-        <w:t>3.6. Diagramy sekwencji</w:t>
-      </w:r>
-      <w:bookmarkEnd w:id="17"/>
-    </w:p>
-    <w:p>
-      <w:pPr>
-        <w:pStyle w:val="Heading2"/>
-      </w:pPr>
-      <w:bookmarkStart w:id="18" w:name="_Toc225960487"/>
-      <w:r>
-        <w:t>3.7. Model danych systemu</w:t>
-      </w:r>
-      <w:bookmarkEnd w:id="18"/>
-    </w:p>
-    <w:p>
-      <w:pPr>
-        <w:pStyle w:val="Heading1"/>
-      </w:pPr>
-      <w:bookmarkStart w:id="19" w:name="_Toc225960488"/>
-      <w:r>
-        <w:t>4. Projekt systemu</w:t>
-      </w:r>
-      <w:bookmarkEnd w:id="19"/>
-    </w:p>
-    <w:p>
-      <w:r>
         <w:rPr>
           <w:highlight w:val="yellow"/>
         </w:rPr>
-        <w:t xml:space="preserve">Do stworzenia serwisu wykorzystano </w:t>
+        <w:t xml:space="preserve"> Next.js</w:t>
+      </w:r>
+      <w:r>
+        <w:rPr>
+          <w:highlight w:val="yellow"/>
+        </w:rPr>
+        <w:t xml:space="preserve"> oraz </w:t>
       </w:r>
       <w:proofErr w:type="spellStart"/>
       <w:r>
         <w:rPr>
           <w:highlight w:val="yellow"/>
         </w:rPr>
-        <w:t>framework</w:t>
+        <w:t>bibiotekę</w:t>
       </w:r>
       <w:proofErr w:type="spellEnd"/>
       <w:r>
         <w:rPr>
           <w:highlight w:val="yellow"/>
         </w:rPr>
-        <w:t xml:space="preserve"> Next.js</w:t>
-      </w:r>
+        <w:t xml:space="preserve"> p5.js do </w:t>
+      </w:r>
+      <w:proofErr w:type="spellStart"/>
       <w:r>
         <w:rPr>
           <w:highlight w:val="yellow"/>
         </w:rPr>
-        <w:t xml:space="preserve"> oraz </w:t>
+        <w:t>renderowania</w:t>
+      </w:r>
+      <w:proofErr w:type="spellEnd"/>
+      <w:r>
+        <w:rPr>
+          <w:highlight w:val="yellow"/>
+        </w:rPr>
+        <w:t xml:space="preserve"> grafiki 2D</w:t>
+      </w:r>
+      <w:r>
+        <w:rPr>
+          <w:highlight w:val="yellow"/>
+        </w:rPr>
+        <w:t xml:space="preserve">. </w:t>
       </w:r>
       <w:proofErr w:type="spellStart"/>
       <w:r>
         <w:rPr>
           <w:highlight w:val="yellow"/>
         </w:rPr>
-        <w:t>bibiotekę</w:t>
+        <w:t>Backend</w:t>
       </w:r>
       <w:proofErr w:type="spellEnd"/>
       <w:r>
         <w:rPr>
           <w:highlight w:val="yellow"/>
         </w:rPr>
-        <w:t xml:space="preserve"> p5.js do </w:t>
+        <w:t xml:space="preserve"> został utworzony na architekturze Express.js, a baza danych wykorzystuje </w:t>
       </w:r>
       <w:proofErr w:type="spellStart"/>
       <w:r>
         <w:rPr>
           <w:highlight w:val="yellow"/>
         </w:rPr>
-        <w:t>renderowania</w:t>
+        <w:t>impementację</w:t>
       </w:r>
       <w:proofErr w:type="spellEnd"/>
       <w:r>
         <w:rPr>
           <w:highlight w:val="yellow"/>
         </w:rPr>
-        <w:t xml:space="preserve"> grafiki 2D</w:t>
-      </w:r>
+        <w:t xml:space="preserve"> </w:t>
+      </w:r>
+      <w:proofErr w:type="spellStart"/>
       <w:r>
         <w:rPr>
           <w:highlight w:val="yellow"/>
         </w:rPr>
-        <w:t xml:space="preserve">. </w:t>
+        <w:t>MariaDB</w:t>
+      </w:r>
+      <w:proofErr w:type="spellEnd"/>
+      <w:r>
+        <w:rPr>
+          <w:highlight w:val="yellow"/>
+        </w:rPr>
+        <w:t xml:space="preserve">. Ten </w:t>
       </w:r>
       <w:proofErr w:type="spellStart"/>
       <w:r>
         <w:rPr>
           <w:highlight w:val="yellow"/>
         </w:rPr>
-        <w:t>Backend</w:t>
+        <w:t>stack</w:t>
       </w:r>
       <w:proofErr w:type="spellEnd"/>
       <w:r>
         <w:rPr>
           <w:highlight w:val="yellow"/>
         </w:rPr>
-        <w:t xml:space="preserve"> został utworzony na architekturze Express.js, a baza danych wykorzystuje </w:t>
-      </w:r>
-      <w:proofErr w:type="spellStart"/>
-      <w:r>
-        <w:rPr>
-          <w:highlight w:val="yellow"/>
-        </w:rPr>
-        <w:t>impementację</w:t>
-      </w:r>
-      <w:proofErr w:type="spellEnd"/>
-      <w:r>
-        <w:rPr>
-          <w:highlight w:val="yellow"/>
-        </w:rPr>
-        <w:t xml:space="preserve"> </w:t>
-      </w:r>
-      <w:proofErr w:type="spellStart"/>
-      <w:r>
-        <w:rPr>
-          <w:highlight w:val="yellow"/>
-        </w:rPr>
-        <w:t>MariaDB</w:t>
-      </w:r>
-      <w:proofErr w:type="spellEnd"/>
-      <w:r>
-        <w:rPr>
-          <w:highlight w:val="yellow"/>
-        </w:rPr>
-        <w:t xml:space="preserve">. Ten </w:t>
-      </w:r>
-      <w:proofErr w:type="spellStart"/>
-      <w:r>
-        <w:rPr>
-          <w:highlight w:val="yellow"/>
-        </w:rPr>
-        <w:t>stack</w:t>
-      </w:r>
-      <w:proofErr w:type="spellEnd"/>
-      <w:r>
-        <w:rPr>
-          <w:highlight w:val="yellow"/>
-        </w:rPr>
-        <w:t xml:space="preserve"> technologiczny umożliwia </w:t>
-      </w:r>
-      <w:r>
-        <w:rPr>
-          <w:highlight w:val="yellow"/>
-        </w:rPr>
-        <w:lastRenderedPageBreak/>
-        <w:t>modularne podejście, które jest kompromisem między wydajnością systemu, a przyjaznością dla implementujących projekt programistów.</w:t>
+        <w:t xml:space="preserve"> technologiczny umożliwia modularne podejście, które jest kompromisem między wydajnością systemu, a przyjaznością dla implementujących projekt programistów.</w:t>
       </w:r>
     </w:p>
     <w:p>
@@ -6130,15 +6256,290 @@
       </w:r>
       <w:bookmarkEnd w:id="48"/>
     </w:p>
+    <w:p/>
+    <w:p/>
+    <w:p/>
+    <w:p/>
+    <w:p/>
+    <w:p/>
+    <w:p/>
+    <w:p/>
+    <w:p/>
+    <w:p/>
+    <w:p/>
     <w:p>
       <w:pPr>
         <w:pStyle w:val="Heading1"/>
       </w:pPr>
       <w:bookmarkStart w:id="49" w:name="_Toc225960518"/>
       <w:r>
+        <w:lastRenderedPageBreak/>
         <w:t>8. Bibliografia</w:t>
       </w:r>
       <w:bookmarkEnd w:id="49"/>
+    </w:p>
+    <w:sdt>
+      <w:sdtPr>
+        <w:rPr>
+          <w:lang w:val="en-GB"/>
+        </w:rPr>
+        <w:id w:val="264126315"/>
+        <w:docPartObj>
+          <w:docPartGallery w:val="Bibliographies"/>
+          <w:docPartUnique/>
+        </w:docPartObj>
+      </w:sdtPr>
+      <w:sdtEndPr>
+        <w:rPr>
+          <w:rFonts w:eastAsiaTheme="minorEastAsia" w:cstheme="minorBidi"/>
+          <w:color w:val="auto"/>
+          <w:sz w:val="22"/>
+          <w:szCs w:val="22"/>
+          <w:lang w:val="pl-PL"/>
+        </w:rPr>
+      </w:sdtEndPr>
+      <w:sdtContent>
+        <w:p>
+          <w:pPr>
+            <w:pStyle w:val="Heading1"/>
+            <w:rPr>
+              <w:lang w:val="en-GB"/>
+            </w:rPr>
+          </w:pPr>
+          <w:r>
+            <w:rPr>
+              <w:lang w:val="en-GB"/>
+            </w:rPr>
+            <w:t>Bibliography</w:t>
+          </w:r>
+        </w:p>
+        <w:sdt>
+          <w:sdtPr>
+            <w:id w:val="111145805"/>
+            <w:bibliography/>
+          </w:sdtPr>
+          <w:sdtContent>
+            <w:p>
+              <w:pPr>
+                <w:pStyle w:val="Bibliography"/>
+                <w:ind w:left="720" w:hanging="720"/>
+                <w:rPr>
+                  <w:noProof/>
+                  <w:sz w:val="24"/>
+                  <w:szCs w:val="24"/>
+                  <w:lang w:val="en-GB"/>
+                </w:rPr>
+              </w:pPr>
+              <w:r>
+                <w:fldChar w:fldCharType="begin"/>
+              </w:r>
+              <w:r>
+                <w:rPr>
+                  <w:lang w:val="en-GB"/>
+                </w:rPr>
+                <w:instrText>BIBLIOGRAPHY</w:instrText>
+              </w:r>
+              <w:r>
+                <w:fldChar w:fldCharType="separate"/>
+              </w:r>
+              <w:r>
+                <w:rPr>
+                  <w:i/>
+                  <w:iCs/>
+                  <w:noProof/>
+                  <w:lang w:val="en-GB"/>
+                </w:rPr>
+                <w:t>forums.unrealengine.com</w:t>
+              </w:r>
+              <w:r>
+                <w:rPr>
+                  <w:noProof/>
+                  <w:lang w:val="en-GB"/>
+                </w:rPr>
+                <w:t>. (2022).</w:t>
+              </w:r>
+            </w:p>
+            <w:p>
+              <w:pPr>
+                <w:pStyle w:val="Bibliography"/>
+                <w:ind w:left="720" w:hanging="720"/>
+                <w:rPr>
+                  <w:noProof/>
+                  <w:lang w:val="en-GB"/>
+                </w:rPr>
+              </w:pPr>
+              <w:r>
+                <w:rPr>
+                  <w:i/>
+                  <w:iCs/>
+                  <w:noProof/>
+                  <w:lang w:val="en-GB"/>
+                </w:rPr>
+                <w:t>steamcommunity.com</w:t>
+              </w:r>
+              <w:r>
+                <w:rPr>
+                  <w:noProof/>
+                  <w:lang w:val="en-GB"/>
+                </w:rPr>
+                <w:t>. (2018).</w:t>
+              </w:r>
+            </w:p>
+            <w:p>
+              <w:pPr>
+                <w:pStyle w:val="Bibliography"/>
+                <w:ind w:left="720" w:hanging="720"/>
+                <w:rPr>
+                  <w:noProof/>
+                  <w:lang w:val="en-GB"/>
+                </w:rPr>
+              </w:pPr>
+              <w:r>
+                <w:rPr>
+                  <w:i/>
+                  <w:iCs/>
+                  <w:noProof/>
+                  <w:lang w:val="en-GB"/>
+                </w:rPr>
+                <w:t>steamdb.info</w:t>
+              </w:r>
+              <w:r>
+                <w:rPr>
+                  <w:noProof/>
+                  <w:lang w:val="en-GB"/>
+                </w:rPr>
+                <w:t>. (2026).</w:t>
+              </w:r>
+            </w:p>
+            <w:p>
+              <w:pPr>
+                <w:pStyle w:val="Bibliography"/>
+                <w:ind w:left="720" w:hanging="720"/>
+                <w:rPr>
+                  <w:noProof/>
+                  <w:lang w:val="en-GB"/>
+                </w:rPr>
+              </w:pPr>
+              <w:r>
+                <w:rPr>
+                  <w:i/>
+                  <w:iCs/>
+                  <w:noProof/>
+                  <w:lang w:val="en-GB"/>
+                </w:rPr>
+                <w:t>store.steampowered.com</w:t>
+              </w:r>
+              <w:r>
+                <w:rPr>
+                  <w:noProof/>
+                  <w:lang w:val="en-GB"/>
+                </w:rPr>
+                <w:t>. (2020).</w:t>
+              </w:r>
+            </w:p>
+            <w:p>
+              <w:pPr>
+                <w:pStyle w:val="Bibliography"/>
+                <w:ind w:left="720" w:hanging="720"/>
+                <w:rPr>
+                  <w:noProof/>
+                  <w:lang w:val="en-GB"/>
+                </w:rPr>
+              </w:pPr>
+              <w:r>
+                <w:rPr>
+                  <w:i/>
+                  <w:iCs/>
+                  <w:noProof/>
+                  <w:lang w:val="en-GB"/>
+                </w:rPr>
+                <w:t>www.adrift.co</w:t>
+              </w:r>
+              <w:r>
+                <w:rPr>
+                  <w:noProof/>
+                  <w:lang w:val="en-GB"/>
+                </w:rPr>
+                <w:t>. (2013).</w:t>
+              </w:r>
+            </w:p>
+            <w:p>
+              <w:pPr>
+                <w:pStyle w:val="Bibliography"/>
+                <w:ind w:left="720" w:hanging="720"/>
+                <w:rPr>
+                  <w:noProof/>
+                  <w:lang w:val="en-GB"/>
+                </w:rPr>
+              </w:pPr>
+              <w:r>
+                <w:rPr>
+                  <w:i/>
+                  <w:iCs/>
+                  <w:noProof/>
+                  <w:lang w:val="en-GB"/>
+                </w:rPr>
+                <w:t>www.ft.com</w:t>
+              </w:r>
+              <w:r>
+                <w:rPr>
+                  <w:noProof/>
+                  <w:lang w:val="en-GB"/>
+                </w:rPr>
+                <w:t>. (2025). Retrieved from https://www.ft.com/content/f4a13716-838a-43da-853b-7c31ac17192c</w:t>
+              </w:r>
+            </w:p>
+            <w:p>
+              <w:pPr>
+                <w:pStyle w:val="Bibliography"/>
+                <w:ind w:left="720" w:hanging="720"/>
+                <w:rPr>
+                  <w:noProof/>
+                  <w:lang w:val="en-GB"/>
+                </w:rPr>
+              </w:pPr>
+              <w:r>
+                <w:rPr>
+                  <w:i/>
+                  <w:iCs/>
+                  <w:noProof/>
+                  <w:lang w:val="en-GB"/>
+                </w:rPr>
+                <w:t>www.videogameseurope.eu</w:t>
+              </w:r>
+              <w:r>
+                <w:rPr>
+                  <w:noProof/>
+                  <w:lang w:val="en-GB"/>
+                </w:rPr>
+                <w:t>. (2023). Retrieved from https://www.videogameseurope.eu/wp-content/uploads/2024/09/Video-Games-Europe-2023-Key-Facts-Report_FINAL.pdf</w:t>
+              </w:r>
+            </w:p>
+            <w:p>
+              <w:pPr>
+                <w:jc w:val="left"/>
+                <w:rPr>
+                  <w:lang w:val="en-GB"/>
+                </w:rPr>
+              </w:pPr>
+              <w:r>
+                <w:rPr>
+                  <w:b/>
+                  <w:bCs/>
+                </w:rPr>
+                <w:fldChar w:fldCharType="end"/>
+              </w:r>
+            </w:p>
+          </w:sdtContent>
+        </w:sdt>
+      </w:sdtContent>
+    </w:sdt>
+    <w:p>
+      <w:pPr>
+        <w:rPr>
+          <w:lang w:val="en-GB"/>
+        </w:rPr>
+      </w:pPr>
     </w:p>
     <w:sectPr>
       <w:footerReference w:type="default" r:id="rId10"/>
@@ -6253,139 +6654,6 @@
       </w:pPr>
       <w:r>
         <w:continuationSeparator/>
-      </w:r>
-    </w:p>
-  </w:footnote>
-  <w:footnote w:id="1">
-    <w:p>
-      <w:pPr>
-        <w:pStyle w:val="FootnoteText"/>
-      </w:pPr>
-      <w:r>
-        <w:rPr>
-          <w:rStyle w:val="FootnoteReference"/>
-        </w:rPr>
-        <w:footnoteRef/>
-      </w:r>
-      <w:r>
-        <w:t xml:space="preserve"> </w:t>
-      </w:r>
-      <w:r>
-        <w:t>https://www.videogameseurope.eu/wp-content/uploads/2024/09/Video-Games-Europe-2023-Key-Facts-Report_FINAL.pdf</w:t>
-      </w:r>
-    </w:p>
-  </w:footnote>
-  <w:footnote w:id="2">
-    <w:p>
-      <w:pPr>
-        <w:pStyle w:val="FootnoteText"/>
-      </w:pPr>
-      <w:r>
-        <w:rPr>
-          <w:rStyle w:val="FootnoteReference"/>
-        </w:rPr>
-        <w:footnoteRef/>
-      </w:r>
-      <w:r>
-        <w:t xml:space="preserve"> </w:t>
-      </w:r>
-      <w:r>
-        <w:t>https://www.ft.com/content/f4a13716-838a-43da-853b-7c31ac17192c</w:t>
-      </w:r>
-    </w:p>
-  </w:footnote>
-  <w:footnote w:id="3">
-    <w:p>
-      <w:pPr>
-        <w:pStyle w:val="FootnoteText"/>
-      </w:pPr>
-      <w:r>
-        <w:rPr>
-          <w:rStyle w:val="FootnoteReference"/>
-        </w:rPr>
-        <w:footnoteRef/>
-      </w:r>
-      <w:r>
-        <w:t xml:space="preserve"> </w:t>
-      </w:r>
-      <w:r>
-        <w:t>https://steamdb.info/stats/releases/</w:t>
-      </w:r>
-    </w:p>
-  </w:footnote>
-  <w:footnote w:id="4">
-    <w:p>
-      <w:pPr>
-        <w:pStyle w:val="FootnoteText"/>
-      </w:pPr>
-      <w:r>
-        <w:rPr>
-          <w:rStyle w:val="FootnoteReference"/>
-        </w:rPr>
-        <w:footnoteRef/>
-      </w:r>
-      <w:r>
-        <w:t xml:space="preserve"> </w:t>
-      </w:r>
-      <w:r>
-        <w:t>https://www.adrift.co/</w:t>
-      </w:r>
-    </w:p>
-  </w:footnote>
-  <w:footnote w:id="5">
-    <w:p>
-      <w:pPr>
-        <w:pStyle w:val="FootnoteText"/>
-      </w:pPr>
-      <w:r>
-        <w:rPr>
-          <w:rStyle w:val="FootnoteReference"/>
-        </w:rPr>
-        <w:footnoteRef/>
-      </w:r>
-      <w:r>
-        <w:t xml:space="preserve"> </w:t>
-      </w:r>
-      <w:r>
-        <w:t>https://forums.unrealengine.com/t/unreal-engine-5-02-size-115-gb/593895</w:t>
-      </w:r>
-    </w:p>
-  </w:footnote>
-  <w:footnote w:id="6">
-    <w:p>
-      <w:pPr>
-        <w:pStyle w:val="FootnoteText"/>
-      </w:pPr>
-      <w:r>
-        <w:rPr>
-          <w:rStyle w:val="FootnoteReference"/>
-        </w:rPr>
-        <w:footnoteRef/>
-      </w:r>
-      <w:r>
-        <w:t xml:space="preserve"> </w:t>
-      </w:r>
-      <w:r>
-        <w:t>https://store.steampowered.com/app/1091500/Cyberpunk_2077/</w:t>
-      </w:r>
-    </w:p>
-  </w:footnote>
-  <w:footnote w:id="7">
-    <w:p>
-      <w:pPr>
-        <w:pStyle w:val="FootnoteText"/>
-      </w:pPr>
-      <w:r>
-        <w:rPr>
-          <w:rStyle w:val="FootnoteReference"/>
-        </w:rPr>
-        <w:footnoteRef/>
-      </w:r>
-      <w:r>
-        <w:t xml:space="preserve"> </w:t>
-      </w:r>
-      <w:r>
-        <w:t>https://steamcommunity.com/groups/steamworks/announcements/detail/1697191267930157838</w:t>
       </w:r>
     </w:p>
   </w:footnote>
@@ -8744,6 +9012,14 @@
       <w:rFonts w:ascii="Book Antiqua" w:hAnsi="Book Antiqua"/>
     </w:rPr>
   </w:style>
+  <w:style w:type="paragraph" w:styleId="Bibliography">
+    <w:name w:val="Bibliography"/>
+    <w:basedOn w:val="Normal"/>
+    <w:next w:val="Normal"/>
+    <w:uiPriority w:val="37"/>
+    <w:unhideWhenUsed/>
+    <w:rsid w:val="00BA3176"/>
+  </w:style>
 </w:styles>
 </file>
 
@@ -9043,11 +9319,76 @@
 </file>
 
 <file path=customXml/item1.xml><?xml version="1.0" encoding="utf-8"?>
-<b:Sources xmlns:b="http://schemas.openxmlformats.org/officeDocument/2006/bibliography" xmlns="http://schemas.openxmlformats.org/officeDocument/2006/bibliography" SelectedStyle="\APASixthEditionOfficeOnline.xsl" StyleName="APA" Version="6"/>
+<b:Sources xmlns:b="http://schemas.openxmlformats.org/officeDocument/2006/bibliography" xmlns="http://schemas.openxmlformats.org/officeDocument/2006/bibliography" SelectedStyle="\APASixthEditionOfficeOnline.xsl" StyleName="APA" Version="6">
+  <b:Source>
+    <b:Tag>for</b:Tag>
+    <b:SourceType>InternetSite</b:SourceType>
+    <b:Guid>{6FF0B101-9EC3-4BC1-9108-32D789426813}</b:Guid>
+    <b:Title>forums.unrealengine.com</b:Title>
+    <b:Medium>https://forums.unrealengine.com/t/unreal-engine-5-02-size-115-gb/593895</b:Medium>
+    <b:Year>2022</b:Year>
+    <b:RefOrder>5</b:RefOrder>
+  </b:Source>
+  <b:Source>
+    <b:Tag>ste1</b:Tag>
+    <b:SourceType>InternetSite</b:SourceType>
+    <b:Guid>{21FB44B8-88F6-4BEB-913B-36863730861D}</b:Guid>
+    <b:Title>steamcommunity.com</b:Title>
+    <b:Medium>https://steamcommunity.com/groups/steamworks/announcements/detail/1697191267930157838</b:Medium>
+    <b:Year>2018</b:Year>
+    <b:RefOrder>7</b:RefOrder>
+  </b:Source>
+  <b:Source>
+    <b:Tag>ste</b:Tag>
+    <b:SourceType>InternetSite</b:SourceType>
+    <b:Guid>{FD4F9A06-C28F-42F8-B9D3-39756A032FCC}</b:Guid>
+    <b:Title>steamdb.info</b:Title>
+    <b:Medium>https://steamdb.info/stats/releases/</b:Medium>
+    <b:Year>2026</b:Year>
+    <b:RefOrder>3</b:RefOrder>
+  </b:Source>
+  <b:Source>
+    <b:Tag>sto</b:Tag>
+    <b:SourceType>InternetSite</b:SourceType>
+    <b:Guid>{01AC36B6-2130-4840-96F9-3108499AAECE}</b:Guid>
+    <b:Title>store.steampowered.com</b:Title>
+    <b:Medium>https://store.steampowered.com/app/1091500/Cyberpunk_2077/</b:Medium>
+    <b:Year>2020</b:Year>
+    <b:RefOrder>6</b:RefOrder>
+  </b:Source>
+  <b:Source>
+    <b:Tag>www2</b:Tag>
+    <b:SourceType>InternetSite</b:SourceType>
+    <b:Guid>{C4D88549-E158-4166-8F46-2649BED69279}</b:Guid>
+    <b:Title>www.adrift.co</b:Title>
+    <b:Medium>https://www.adrift.co/</b:Medium>
+    <b:Year>2013</b:Year>
+    <b:RefOrder>4</b:RefOrder>
+  </b:Source>
+  <b:Source>
+    <b:Tag>www1</b:Tag>
+    <b:SourceType>InternetSite</b:SourceType>
+    <b:Guid>{62D6E2C1-356B-47AD-8AEB-14E8C90EFE36}</b:Guid>
+    <b:Title>www.ft.com</b:Title>
+    <b:URL>https://www.ft.com/content/f4a13716-838a-43da-853b-7c31ac17192c</b:URL>
+    <b:Year>2025</b:Year>
+    <b:Medium>https://www.ft.com/content/f4a13716-838a-43da-853b-7c31ac17192c</b:Medium>
+    <b:RefOrder>2</b:RefOrder>
+  </b:Source>
+  <b:Source>
+    <b:Tag>www</b:Tag>
+    <b:SourceType>InternetSite</b:SourceType>
+    <b:Guid>{44DE04EE-E387-45F3-B9F6-14B75DBC3732}</b:Guid>
+    <b:Title>www.videogameseurope.eu</b:Title>
+    <b:URL>https://www.videogameseurope.eu/wp-content/uploads/2024/09/Video-Games-Europe-2023-Key-Facts-Report_FINAL.pdf</b:URL>
+    <b:Year>2023</b:Year>
+    <b:RefOrder>1</b:RefOrder>
+  </b:Source>
+</b:Sources>
 </file>
 
 <file path=customXml/itemProps1.xml><?xml version="1.0" encoding="utf-8"?>
-<ds:datastoreItem xmlns:ds="http://schemas.openxmlformats.org/officeDocument/2006/customXml" ds:itemID="{F38DAE60-2E85-4383-94BF-04B9D8575905}">
+<ds:datastoreItem xmlns:ds="http://schemas.openxmlformats.org/officeDocument/2006/customXml" ds:itemID="{D5323FBB-04CB-4681-B2C5-C5D5E60BA79E}">
   <ds:schemaRefs>
     <ds:schemaRef ds:uri="http://schemas.openxmlformats.org/officeDocument/2006/bibliography"/>
   </ds:schemaRefs>

</xml_diff>

<commit_message>
rozdzial 2 poprawka v3
</commit_message>
<xml_diff>
--- a/Praca Licencjacka/Praca Licencjacka.docx
+++ b/Praca Licencjacka/Praca Licencjacka.docx
@@ -4170,7 +4170,7 @@
             <w:rPr>
               <w:noProof/>
             </w:rPr>
-            <w:t>(www.videogameseurope.eu, 2023)</w:t>
+            <w:t>(www.videogameseurope.eu)</w:t>
           </w:r>
           <w:r>
             <w:rPr>
@@ -4234,7 +4234,7 @@
             <w:rPr>
               <w:noProof/>
             </w:rPr>
-            <w:t>(www.ft.com, 2025)</w:t>
+            <w:t>(www.ft.com)</w:t>
           </w:r>
           <w:r>
             <w:fldChar w:fldCharType="end"/>
@@ -4269,7 +4269,7 @@
             <w:rPr>
               <w:noProof/>
             </w:rPr>
-            <w:t>(steamdb.info, 2026)</w:t>
+            <w:t>(steamdb.info)</w:t>
           </w:r>
           <w:r>
             <w:fldChar w:fldCharType="end"/>
@@ -4669,7 +4669,7 @@
             <w:rPr>
               <w:noProof/>
             </w:rPr>
-            <w:t>(www.adrift.co, 2013)</w:t>
+            <w:t>(www.adrift.co)</w:t>
           </w:r>
           <w:r>
             <w:rPr>
@@ -5135,7 +5135,7 @@
             <w:rPr>
               <w:noProof/>
             </w:rPr>
-            <w:t>(forums.unrealengine.com, 2022)</w:t>
+            <w:t>(forums.unrealengine.com)</w:t>
           </w:r>
           <w:r>
             <w:fldChar w:fldCharType="end"/>
@@ -5449,7 +5449,7 @@
             <w:rPr>
               <w:noProof/>
             </w:rPr>
-            <w:t>(store.steampowered.com, 2020)</w:t>
+            <w:t>(store.steampowered.com)</w:t>
           </w:r>
           <w:r>
             <w:fldChar w:fldCharType="end"/>
@@ -5590,7 +5590,7 @@
             <w:rPr>
               <w:noProof/>
             </w:rPr>
-            <w:t>(steamcommunity.com, 2018)</w:t>
+            <w:t>(steamcommunity.com)</w:t>
           </w:r>
           <w:r>
             <w:fldChar w:fldCharType="end"/>
@@ -6281,6 +6281,10 @@
     <w:sdt>
       <w:sdtPr>
         <w:rPr>
+          <w:rFonts w:eastAsiaTheme="minorEastAsia" w:cstheme="minorBidi"/>
+          <w:color w:val="auto"/>
+          <w:sz w:val="22"/>
+          <w:szCs w:val="22"/>
           <w:lang w:val="en-GB"/>
         </w:rPr>
         <w:id w:val="264126315"/>
@@ -6291,10 +6295,6 @@
       </w:sdtPr>
       <w:sdtEndPr>
         <w:rPr>
-          <w:rFonts w:eastAsiaTheme="minorEastAsia" w:cstheme="minorBidi"/>
-          <w:color w:val="auto"/>
-          <w:sz w:val="22"/>
-          <w:szCs w:val="22"/>
           <w:lang w:val="pl-PL"/>
         </w:rPr>
       </w:sdtEndPr>
@@ -6306,12 +6306,6 @@
               <w:lang w:val="en-GB"/>
             </w:rPr>
           </w:pPr>
-          <w:r>
-            <w:rPr>
-              <w:lang w:val="en-GB"/>
-            </w:rPr>
-            <w:t>Bibliography</w:t>
-          </w:r>
         </w:p>
         <w:sdt>
           <w:sdtPr>
@@ -6323,6 +6317,7 @@
               <w:pPr>
                 <w:pStyle w:val="Bibliography"/>
                 <w:ind w:left="720" w:hanging="720"/>
+                <w:jc w:val="left"/>
                 <w:rPr>
                   <w:noProof/>
                   <w:sz w:val="24"/>
@@ -6356,13 +6351,14 @@
                   <w:noProof/>
                   <w:lang w:val="en-GB"/>
                 </w:rPr>
-                <w:t>. (2022).</w:t>
+                <w:t>. 2022. https://forums.unrealengine.com/t/unreal-engine-5-02-size-115-gb/593895.</w:t>
               </w:r>
             </w:p>
             <w:p>
               <w:pPr>
                 <w:pStyle w:val="Bibliography"/>
                 <w:ind w:left="720" w:hanging="720"/>
+                <w:jc w:val="left"/>
                 <w:rPr>
                   <w:noProof/>
                   <w:lang w:val="en-GB"/>
@@ -6382,13 +6378,14 @@
                   <w:noProof/>
                   <w:lang w:val="en-GB"/>
                 </w:rPr>
-                <w:t>. (2018).</w:t>
+                <w:t>. 2018. https://steamcommunity.com/groups/steamworks/announcements/detail/1697191267930157838.</w:t>
               </w:r>
             </w:p>
             <w:p>
               <w:pPr>
                 <w:pStyle w:val="Bibliography"/>
                 <w:ind w:left="720" w:hanging="720"/>
+                <w:jc w:val="left"/>
                 <w:rPr>
                   <w:noProof/>
                   <w:lang w:val="en-GB"/>
@@ -6408,13 +6405,14 @@
                   <w:noProof/>
                   <w:lang w:val="en-GB"/>
                 </w:rPr>
-                <w:t>. (2026).</w:t>
+                <w:t>. 2026. https://steamdb.info/stats/releases/.</w:t>
               </w:r>
             </w:p>
             <w:p>
               <w:pPr>
                 <w:pStyle w:val="Bibliography"/>
                 <w:ind w:left="720" w:hanging="720"/>
+                <w:jc w:val="left"/>
                 <w:rPr>
                   <w:noProof/>
                   <w:lang w:val="en-GB"/>
@@ -6434,13 +6432,14 @@
                   <w:noProof/>
                   <w:lang w:val="en-GB"/>
                 </w:rPr>
-                <w:t>. (2020).</w:t>
+                <w:t>. 2020. https://store.steampowered.com/app/1091500/Cyberpunk_2077/.</w:t>
               </w:r>
             </w:p>
             <w:p>
               <w:pPr>
                 <w:pStyle w:val="Bibliography"/>
                 <w:ind w:left="720" w:hanging="720"/>
+                <w:jc w:val="left"/>
                 <w:rPr>
                   <w:noProof/>
                   <w:lang w:val="en-GB"/>
@@ -6460,13 +6459,14 @@
                   <w:noProof/>
                   <w:lang w:val="en-GB"/>
                 </w:rPr>
-                <w:t>. (2013).</w:t>
+                <w:t>. 2013. https://www.adrift.co/.</w:t>
               </w:r>
             </w:p>
             <w:p>
               <w:pPr>
                 <w:pStyle w:val="Bibliography"/>
                 <w:ind w:left="720" w:hanging="720"/>
+                <w:jc w:val="left"/>
                 <w:rPr>
                   <w:noProof/>
                   <w:lang w:val="en-GB"/>
@@ -6486,13 +6486,14 @@
                   <w:noProof/>
                   <w:lang w:val="en-GB"/>
                 </w:rPr>
-                <w:t>. (2025). Retrieved from https://www.ft.com/content/f4a13716-838a-43da-853b-7c31ac17192c</w:t>
+                <w:t>. 2025. https://www.ft.com/content/f4a13716-838a-43da-853b-7c31ac17192c. &lt;https://www.ft.com/content/f4a13716-838a-43da-853b-7c31ac17192c&gt;.</w:t>
               </w:r>
             </w:p>
             <w:p>
               <w:pPr>
                 <w:pStyle w:val="Bibliography"/>
                 <w:ind w:left="720" w:hanging="720"/>
+                <w:jc w:val="left"/>
                 <w:rPr>
                   <w:noProof/>
                   <w:lang w:val="en-GB"/>
@@ -6512,7 +6513,7 @@
                   <w:noProof/>
                   <w:lang w:val="en-GB"/>
                 </w:rPr>
-                <w:t>. (2023). Retrieved from https://www.videogameseurope.eu/wp-content/uploads/2024/09/Video-Games-Europe-2023-Key-Facts-Report_FINAL.pdf</w:t>
+                <w:t>. 2023. &lt;https://www.videogameseurope.eu/wp-content/uploads/2024/09/Video-Games-Europe-2023-Key-Facts-Report_FINAL.pdf&gt;.</w:t>
               </w:r>
             </w:p>
             <w:p>
@@ -9319,7 +9320,7 @@
 </file>
 
 <file path=customXml/item1.xml><?xml version="1.0" encoding="utf-8"?>
-<b:Sources xmlns:b="http://schemas.openxmlformats.org/officeDocument/2006/bibliography" xmlns="http://schemas.openxmlformats.org/officeDocument/2006/bibliography" SelectedStyle="\APASixthEditionOfficeOnline.xsl" StyleName="APA" Version="6">
+<b:Sources xmlns:b="http://schemas.openxmlformats.org/officeDocument/2006/bibliography" xmlns="http://schemas.openxmlformats.org/officeDocument/2006/bibliography" SelectedStyle="\MLASeventhEditionOfficeOnline.xsl" StyleName="MLA" Version="7">
   <b:Source>
     <b:Tag>for</b:Tag>
     <b:SourceType>InternetSite</b:SourceType>
@@ -9388,7 +9389,7 @@
 </file>
 
 <file path=customXml/itemProps1.xml><?xml version="1.0" encoding="utf-8"?>
-<ds:datastoreItem xmlns:ds="http://schemas.openxmlformats.org/officeDocument/2006/customXml" ds:itemID="{D5323FBB-04CB-4681-B2C5-C5D5E60BA79E}">
+<ds:datastoreItem xmlns:ds="http://schemas.openxmlformats.org/officeDocument/2006/customXml" ds:itemID="{9E810DAD-8BFD-4FE1-A81E-C02B0125627D}">
   <ds:schemaRefs>
     <ds:schemaRef ds:uri="http://schemas.openxmlformats.org/officeDocument/2006/bibliography"/>
   </ds:schemaRefs>

</xml_diff>